<commit_message>
Expand requirements guide: verified Forms & Annexes section for key permits
- New appendix with verified form codes: FBL Form Tor.2 (corrected from P.13), BOI 8.2.1.1/8.2.1.2 activity codes + Benefits Plan, EIA statutory contents (ONEP/EIEB), Company Reg (Bor.Or.Jor./Bor.Or.Jor.5), Building (Khor.1/Or.1), Factory (Ror.Ngor.)
- Cross-checked against BOI Guide 2025, DBD FBA handbook, ONEP EIA guidance (June 2026)
</commit_message>
<xml_diff>
--- a/documentation/08_PERMIT_REQUIREMENTS_EXPLAINED.docx
+++ b/documentation/08_PERMIT_REQUIREMENTS_EXPLAINED.docx
@@ -1054,10 +1054,10 @@
         <w:rPr>
           <w:b/>
         </w:rPr>
-        <w:t xml:space="preserve">Application form P.13 — </w:t>
-      </w:r>
-      <w:r>
-        <w:t>The FBL application describing the foreign business activity, capacity and how it benefits Thailand (technology transfer, jobs, local spend). The 'benefit to Thailand' narrative is decisive for the committee.</w:t>
+        <w:t xml:space="preserve">Application form Tor. 2 (ต.2) — </w:t>
+      </w:r>
+      <w:r>
+        <w:t>The statutory FBL application under the Foreign Business Act B.E. 2542, lodged with the Bureau of Foreign Business Administration, DBD. It describes the foreign business activity, size, intended operating period, number of employees in Thailand and the expected benefit to Thailand's economy — that benefit narrative is decisive for the committee.</w:t>
       </w:r>
     </w:p>
     <w:p>
@@ -7499,6 +7499,22 @@
     </w:p>
     <w:p/>
     <w:p>
+      <w:r>
+        <w:br w:type="page"/>
+      </w:r>
+    </w:p>
+    <w:p>
+      <w:pPr>
+        <w:pStyle w:val="Heading1"/>
+      </w:pPr>
+      <w:r>
+        <w:rPr>
+          <w:color w:val="5B4AB0"/>
+        </w:rPr>
+        <w:t>Forms &amp; annexes — verified detail for the key permits</w:t>
+      </w:r>
+    </w:p>
+    <w:p>
       <w:pPr>
         <w:spacing w:after="80"/>
       </w:pPr>
@@ -7509,7 +7525,709 @@
           <w:color w:val="555566"/>
           <w:sz w:val="18"/>
         </w:rPr>
-        <w:t>Prepared from the CHN1A permitting research package (Master Permitting Guide, EIA &amp; FBL detailed guides, BOI updates analysis, and the 23 permit checklists). Figures are planning estimates — confirm current requirements with each authority before lodging.</w:t>
+        <w:t>The form codes and statutory contents below were checked against official/government sources (BOI Investment Promotion Guide 2025, the DBD Foreign Business Act application handbook, and ONEP EIA guidance). Always download the current form from the authority's portal before lodging — codes and annex lists are updated periodically.</w:t>
+      </w:r>
+    </w:p>
+    <w:p/>
+    <w:p>
+      <w:pPr>
+        <w:pStyle w:val="Heading2"/>
+      </w:pPr>
+      <w:r>
+        <w:rPr>
+          <w:color w:val="5B4AB0"/>
+        </w:rPr>
+        <w:t>Company Registration — forms</w:t>
+      </w:r>
+    </w:p>
+    <w:p>
+      <w:pPr>
+        <w:spacing w:after="40"/>
+      </w:pPr>
+      <w:r>
+        <w:rPr>
+          <w:b/>
+        </w:rPr>
+        <w:t xml:space="preserve">Authority: </w:t>
+      </w:r>
+      <w:r>
+        <w:t>Department of Business Development (DBD), via DBD e-Registration</w:t>
+      </w:r>
+    </w:p>
+    <w:p>
+      <w:pPr>
+        <w:spacing w:after="40"/>
+      </w:pPr>
+      <w:r>
+        <w:rPr>
+          <w:b/>
+        </w:rPr>
+        <w:t xml:space="preserve">Core forms: </w:t>
+      </w:r>
+      <w:r>
+        <w:t>Memorandum of Association (MOA) registration; statutory-meeting minutes; company-registration application (Bor.Or.Jor. set); shareholder list Bor.Or.Jor.5</w:t>
+      </w:r>
+    </w:p>
+    <w:p>
+      <w:pPr>
+        <w:spacing w:after="40"/>
+      </w:pPr>
+      <w:r>
+        <w:rPr>
+          <w:b/>
+        </w:rPr>
+        <w:t xml:space="preserve">Tax: </w:t>
+      </w:r>
+      <w:r>
+        <w:t>VAT/Tax-ID registration via the Revenue Department (Phor.Phor.01 / Phor.Phor.20) once registered</w:t>
+      </w:r>
+    </w:p>
+    <w:p>
+      <w:pPr>
+        <w:spacing w:after="40"/>
+      </w:pPr>
+      <w:r>
+        <w:rPr>
+          <w:b/>
+          <w:i w:val="0"/>
+          <w:color w:val="202440"/>
+        </w:rPr>
+        <w:t>Filed together as the incorporation packet:</w:t>
+      </w:r>
+    </w:p>
+    <w:p>
+      <w:pPr>
+        <w:pStyle w:val="ListBullet"/>
+        <w:spacing w:after="40"/>
+      </w:pPr>
+      <w:r>
+        <w:t>MOA — objectives (must include data-centre/IT-infrastructure operation), registered capital and shares</w:t>
+      </w:r>
+    </w:p>
+    <w:p>
+      <w:pPr>
+        <w:pStyle w:val="ListBullet"/>
+        <w:spacing w:after="40"/>
+      </w:pPr>
+      <w:r>
+        <w:t>List of promoters/shareholders with nationalities and shareholding (Bor.Or.Jor.5)</w:t>
+      </w:r>
+    </w:p>
+    <w:p>
+      <w:pPr>
+        <w:pStyle w:val="ListBullet"/>
+        <w:spacing w:after="40"/>
+      </w:pPr>
+      <w:r>
+        <w:t>Directors' details and authorised-signatory/seal arrangement</w:t>
+      </w:r>
+    </w:p>
+    <w:p>
+      <w:pPr>
+        <w:pStyle w:val="ListBullet"/>
+        <w:spacing w:after="40"/>
+      </w:pPr>
+      <w:r>
+        <w:t>Registered-office consent letter + house registration (Tabien Baan) + location map</w:t>
+      </w:r>
+    </w:p>
+    <w:p>
+      <w:pPr>
+        <w:pStyle w:val="ListBullet"/>
+        <w:spacing w:after="40"/>
+      </w:pPr>
+      <w:r>
+        <w:t>Company affidavit (Nangsue Rabrong) is issued on registration — keep certified copies</w:t>
+      </w:r>
+    </w:p>
+    <w:p/>
+    <w:p>
+      <w:pPr>
+        <w:pStyle w:val="Heading2"/>
+      </w:pPr>
+      <w:r>
+        <w:rPr>
+          <w:color w:val="5B4AB0"/>
+        </w:rPr>
+        <w:t>BOI Promotion — application &amp; annexes</w:t>
+      </w:r>
+    </w:p>
+    <w:p>
+      <w:pPr>
+        <w:spacing w:after="40"/>
+      </w:pPr>
+      <w:r>
+        <w:rPr>
+          <w:b/>
+        </w:rPr>
+        <w:t xml:space="preserve">Authority: </w:t>
+      </w:r>
+      <w:r>
+        <w:t>Thailand Board of Investment (BOI), via the BOI online e-Investment system</w:t>
+      </w:r>
+    </w:p>
+    <w:p>
+      <w:pPr>
+        <w:spacing w:after="40"/>
+      </w:pPr>
+      <w:r>
+        <w:rPr>
+          <w:b/>
+        </w:rPr>
+        <w:t xml:space="preserve">Activity codes: </w:t>
+      </w:r>
+      <w:r>
+        <w:t>8.2.1.1 — data centre with high power-usage effectiveness (8-year CIT exemption, capped); 8.2.1.2 — other data centre (5-year CIT exemption, cap 100% of investment)</w:t>
+      </w:r>
+    </w:p>
+    <w:p>
+      <w:pPr>
+        <w:spacing w:after="40"/>
+      </w:pPr>
+      <w:r>
+        <w:rPr>
+          <w:b/>
+        </w:rPr>
+        <w:t xml:space="preserve">Hard prerequisite: </w:t>
+      </w:r>
+      <w:r>
+        <w:t>ERC/MEA/PEA power-availability confirmation before the application is accepted</w:t>
+      </w:r>
+    </w:p>
+    <w:p>
+      <w:pPr>
+        <w:spacing w:after="40"/>
+      </w:pPr>
+      <w:r>
+        <w:rPr>
+          <w:b/>
+          <w:i w:val="0"/>
+          <w:color w:val="202440"/>
+        </w:rPr>
+        <w:t>Annexes submitted with the online application (certified Thai translations, PDF):</w:t>
+      </w:r>
+    </w:p>
+    <w:p>
+      <w:pPr>
+        <w:pStyle w:val="ListBullet"/>
+        <w:spacing w:after="40"/>
+      </w:pPr>
+      <w:r>
+        <w:t>Detailed business plan and 3-year financial projections (feasibility study above ~2 bn THB investment)</w:t>
+      </w:r>
+    </w:p>
+    <w:p>
+      <w:pPr>
+        <w:pStyle w:val="ListBullet"/>
+        <w:spacing w:after="40"/>
+      </w:pPr>
+      <w:r>
+        <w:t>Electricity and water management plans; technical pack (single-line, cooling, network)</w:t>
+      </w:r>
+    </w:p>
+    <w:p>
+      <w:pPr>
+        <w:pStyle w:val="ListBullet"/>
+        <w:spacing w:after="40"/>
+      </w:pPr>
+      <w:r>
+        <w:t>PUE modelling / CFD studies — required to claim 8.2.1.1</w:t>
+      </w:r>
+    </w:p>
+    <w:p>
+      <w:pPr>
+        <w:pStyle w:val="ListBullet"/>
+        <w:spacing w:after="40"/>
+      </w:pPr>
+      <w:r>
+        <w:t>Thailand Benefits Plan — training &amp; knowledge-transfer to Thai nationals, local supply chain (must be fully implemented BEFORE the CIT exemption can be exercised)</w:t>
+      </w:r>
+    </w:p>
+    <w:p>
+      <w:pPr>
+        <w:pStyle w:val="ListBullet"/>
+        <w:spacing w:after="40"/>
+      </w:pPr>
+      <w:r>
+        <w:t>Shareholder list with nationalities; parent-company audited financials &amp; incorporation cert (apostilled) for corporate investors</w:t>
+      </w:r>
+    </w:p>
+    <w:p>
+      <w:pPr>
+        <w:pStyle w:val="ListBullet"/>
+        <w:spacing w:after="40"/>
+      </w:pPr>
+      <w:r>
+        <w:t>ISO/IEC 27001 roadmap (feeds the later tax-activation verification)</w:t>
+      </w:r>
+    </w:p>
+    <w:p>
+      <w:pPr>
+        <w:spacing w:after="80"/>
+      </w:pPr>
+      <w:r>
+        <w:rPr>
+          <w:b w:val="0"/>
+          <w:i/>
+          <w:color w:val="555566"/>
+          <w:sz w:val="18"/>
+        </w:rPr>
+        <w:t>Note: BOI now runs quarterly e-Monitoring; two consecutive missed reports can revoke the certificate.</w:t>
+      </w:r>
+    </w:p>
+    <w:p/>
+    <w:p>
+      <w:pPr>
+        <w:pStyle w:val="Heading2"/>
+      </w:pPr>
+      <w:r>
+        <w:rPr>
+          <w:color w:val="5B4AB0"/>
+        </w:rPr>
+        <w:t>Foreign Business License — Form Tor. 2 (ต.2)</w:t>
+      </w:r>
+    </w:p>
+    <w:p>
+      <w:pPr>
+        <w:spacing w:after="40"/>
+      </w:pPr>
+      <w:r>
+        <w:rPr>
+          <w:b/>
+        </w:rPr>
+        <w:t xml:space="preserve">Authority: </w:t>
+      </w:r>
+      <w:r>
+        <w:t>Bureau of Foreign Business Administration, DBD (or Provincial Business Development Office)</w:t>
+      </w:r>
+    </w:p>
+    <w:p>
+      <w:pPr>
+        <w:spacing w:after="40"/>
+      </w:pPr>
+      <w:r>
+        <w:rPr>
+          <w:b/>
+        </w:rPr>
+        <w:t xml:space="preserve">Statute / fee / time: </w:t>
+      </w:r>
+      <w:r>
+        <w:t>Foreign Business Act B.E. 2542; application fee 2,000 THB; statutory consideration within 60 days</w:t>
+      </w:r>
+    </w:p>
+    <w:p>
+      <w:pPr>
+        <w:spacing w:after="40"/>
+      </w:pPr>
+      <w:r>
+        <w:rPr>
+          <w:b/>
+          <w:i w:val="0"/>
+          <w:color w:val="202440"/>
+        </w:rPr>
+        <w:t>Documents accompanying Form Tor. 2:</w:t>
+      </w:r>
+    </w:p>
+    <w:p>
+      <w:pPr>
+        <w:pStyle w:val="ListBullet"/>
+        <w:spacing w:after="40"/>
+      </w:pPr>
+      <w:r>
+        <w:t>Identification document for the foreigner (passport/affidavit), apostilled + translated</w:t>
+      </w:r>
+    </w:p>
+    <w:p>
+      <w:pPr>
+        <w:pStyle w:val="ListBullet"/>
+        <w:spacing w:after="40"/>
+      </w:pPr>
+      <w:r>
+        <w:t>Certification that the applicant holds the correct qualifications and has none of the prohibited characteristics under Section 16 of the Foreign Business Act</w:t>
+      </w:r>
+    </w:p>
+    <w:p>
+      <w:pPr>
+        <w:pStyle w:val="ListBullet"/>
+        <w:spacing w:after="40"/>
+      </w:pPr>
+      <w:r>
+        <w:t>Letter of business detail — type &amp; size of business, intended operating period, number of employees in Thailand, and the expected overall benefit to Thailand's economy</w:t>
+      </w:r>
+    </w:p>
+    <w:p>
+      <w:pPr>
+        <w:pStyle w:val="ListBullet"/>
+        <w:spacing w:after="40"/>
+      </w:pPr>
+      <w:r>
+        <w:t>Map indicating the approximate location of the place of business in Thailand</w:t>
+      </w:r>
+    </w:p>
+    <w:p>
+      <w:pPr>
+        <w:pStyle w:val="ListBullet"/>
+        <w:spacing w:after="40"/>
+      </w:pPr>
+      <w:r>
+        <w:t>Minimum-capital evidence (≥2M THB; 3M+ for List 2/3 activities) with bank certification</w:t>
+      </w:r>
+    </w:p>
+    <w:p>
+      <w:pPr>
+        <w:spacing w:after="80"/>
+      </w:pPr>
+      <w:r>
+        <w:rPr>
+          <w:b w:val="0"/>
+          <w:i/>
+          <w:color w:val="555566"/>
+          <w:sz w:val="18"/>
+        </w:rPr>
+        <w:t>Note: if the BOI card already grants a Foreign Business Certificate for the activity, a separate FBL may be unnecessary.</w:t>
+      </w:r>
+    </w:p>
+    <w:p/>
+    <w:p>
+      <w:pPr>
+        <w:pStyle w:val="Heading2"/>
+      </w:pPr>
+      <w:r>
+        <w:rPr>
+          <w:color w:val="5B4AB0"/>
+        </w:rPr>
+        <w:t>EIA — statutory report contents (ONEP / EIEB)</w:t>
+      </w:r>
+    </w:p>
+    <w:p>
+      <w:pPr>
+        <w:spacing w:after="40"/>
+      </w:pPr>
+      <w:r>
+        <w:rPr>
+          <w:b/>
+        </w:rPr>
+        <w:t xml:space="preserve">Authority: </w:t>
+      </w:r>
+      <w:r>
+        <w:t>Environmental Impact Evaluation Bureau (EIEB), under ONEP</w:t>
+      </w:r>
+    </w:p>
+    <w:p>
+      <w:pPr>
+        <w:spacing w:after="40"/>
+      </w:pPr>
+      <w:r>
+        <w:rPr>
+          <w:b/>
+        </w:rPr>
+        <w:t xml:space="preserve">Phases assessed: </w:t>
+      </w:r>
+      <w:r>
+        <w:t>Construction phase and operation phase (cumulative impacts included)</w:t>
+      </w:r>
+    </w:p>
+    <w:p>
+      <w:pPr>
+        <w:spacing w:after="40"/>
+      </w:pPr>
+      <w:r>
+        <w:rPr>
+          <w:b/>
+          <w:i w:val="0"/>
+          <w:color w:val="202440"/>
+        </w:rPr>
+        <w:t>By law the EIA report must at minimum contain:</w:t>
+      </w:r>
+    </w:p>
+    <w:p>
+      <w:pPr>
+        <w:pStyle w:val="ListBullet"/>
+        <w:spacing w:after="40"/>
+      </w:pPr>
+      <w:r>
+        <w:t>Detailed project description and land-use plan (with location map at 1:50,000 or other appropriate scale)</w:t>
+      </w:r>
+    </w:p>
+    <w:p>
+      <w:pPr>
+        <w:pStyle w:val="ListBullet"/>
+        <w:spacing w:after="40"/>
+      </w:pPr>
+      <w:r>
+        <w:t>Current/existing environmental situation — physical, biological, human-use and quality-of-life values, classified as capable / incapable of rehabilitation, with surrounding-area map</w:t>
+      </w:r>
+    </w:p>
+    <w:p>
+      <w:pPr>
+        <w:pStyle w:val="ListBullet"/>
+        <w:spacing w:after="40"/>
+      </w:pPr>
+      <w:r>
+        <w:t>Analysis of alternatives that could be operated</w:t>
+      </w:r>
+    </w:p>
+    <w:p>
+      <w:pPr>
+        <w:pStyle w:val="ListBullet"/>
+        <w:spacing w:after="40"/>
+      </w:pPr>
+      <w:r>
+        <w:t>Assessment of direct and indirect impacts — incl. air-quality and water-quality impacts vs. the area's assimilative capacity</w:t>
+      </w:r>
+    </w:p>
+    <w:p>
+      <w:pPr>
+        <w:pStyle w:val="ListBullet"/>
+        <w:spacing w:after="40"/>
+      </w:pPr>
+      <w:r>
+        <w:t>Public participation in the assessment (consultation record)</w:t>
+      </w:r>
+    </w:p>
+    <w:p>
+      <w:pPr>
+        <w:pStyle w:val="ListBullet"/>
+        <w:spacing w:after="40"/>
+      </w:pPr>
+      <w:r>
+        <w:t>Measures to prevent and rectify impacts, and to compensate/remedy damage — plus the monitoring programme</w:t>
+      </w:r>
+    </w:p>
+    <w:p>
+      <w:pPr>
+        <w:spacing w:after="80"/>
+      </w:pPr>
+      <w:r>
+        <w:rPr>
+          <w:b w:val="0"/>
+          <w:i/>
+          <w:color w:val="555566"/>
+          <w:sz w:val="18"/>
+        </w:rPr>
+        <w:t>Note: the report must be authored by an ONEP-licensed EIA consultant; the TOR agreed at screening fixes the exact baseline scope.</w:t>
+      </w:r>
+    </w:p>
+    <w:p/>
+    <w:p>
+      <w:pPr>
+        <w:pStyle w:val="Heading2"/>
+      </w:pPr>
+      <w:r>
+        <w:rPr>
+          <w:color w:val="5B4AB0"/>
+        </w:rPr>
+        <w:t>Building Permit — forms</w:t>
+      </w:r>
+    </w:p>
+    <w:p>
+      <w:pPr>
+        <w:spacing w:after="40"/>
+      </w:pPr>
+      <w:r>
+        <w:rPr>
+          <w:b/>
+        </w:rPr>
+        <w:t xml:space="preserve">Authority: </w:t>
+      </w:r>
+      <w:r>
+        <w:t>Local Building Control Authority, under the Building Control Act B.E. 2522</w:t>
+      </w:r>
+    </w:p>
+    <w:p>
+      <w:pPr>
+        <w:spacing w:after="40"/>
+      </w:pPr>
+      <w:r>
+        <w:rPr>
+          <w:b/>
+        </w:rPr>
+        <w:t xml:space="preserve">Core forms: </w:t>
+      </w:r>
+      <w:r>
+        <w:t>Construction-permit application (Form Khor.1); permit issued as Form Or.1; modification/【use change uses Khor./Or. series</w:t>
+      </w:r>
+    </w:p>
+    <w:p>
+      <w:pPr>
+        <w:spacing w:after="40"/>
+      </w:pPr>
+      <w:r>
+        <w:rPr>
+          <w:b/>
+          <w:i w:val="0"/>
+          <w:color w:val="202440"/>
+        </w:rPr>
+        <w:t>Submitted with the application:</w:t>
+      </w:r>
+    </w:p>
+    <w:p>
+      <w:pPr>
+        <w:pStyle w:val="ListBullet"/>
+        <w:spacing w:after="40"/>
+      </w:pPr>
+      <w:r>
+        <w:t>Architectural, structural (with calculations) and MEP drawing sets, each sealed by a Thai-licensed professional</w:t>
+      </w:r>
+    </w:p>
+    <w:p>
+      <w:pPr>
+        <w:pStyle w:val="ListBullet"/>
+        <w:spacing w:after="40"/>
+      </w:pPr>
+      <w:r>
+        <w:t>Fire &amp; life-safety plan; title deed + zoning confirmation</w:t>
+      </w:r>
+    </w:p>
+    <w:p>
+      <w:pPr>
+        <w:pStyle w:val="ListBullet"/>
+        <w:spacing w:after="40"/>
+      </w:pPr>
+      <w:r>
+        <w:t>EIA approval letter attached where the project requires EIA</w:t>
+      </w:r>
+    </w:p>
+    <w:p>
+      <w:pPr>
+        <w:pStyle w:val="ListBullet"/>
+        <w:spacing w:after="40"/>
+      </w:pPr>
+      <w:r>
+        <w:t>Engineer/architect licence copies and letters of undertaking</w:t>
+      </w:r>
+    </w:p>
+    <w:p/>
+    <w:p>
+      <w:pPr>
+        <w:pStyle w:val="Heading2"/>
+      </w:pPr>
+      <w:r>
+        <w:rPr>
+          <w:color w:val="5B4AB0"/>
+        </w:rPr>
+        <w:t>Factory License — forms (DIW)</w:t>
+      </w:r>
+    </w:p>
+    <w:p>
+      <w:pPr>
+        <w:spacing w:after="40"/>
+      </w:pPr>
+      <w:r>
+        <w:rPr>
+          <w:b/>
+        </w:rPr>
+        <w:t xml:space="preserve">Authority: </w:t>
+      </w:r>
+      <w:r>
+        <w:t>Department of Industrial Works (DIW), under the Factory Act B.E. 2535 (as amended)</w:t>
+      </w:r>
+    </w:p>
+    <w:p>
+      <w:pPr>
+        <w:spacing w:after="40"/>
+      </w:pPr>
+      <w:r>
+        <w:rPr>
+          <w:b/>
+        </w:rPr>
+        <w:t xml:space="preserve">Core forms: </w:t>
+      </w:r>
+      <w:r>
+        <w:t>Factory establishment/operation licence application (Ror.Ngor. series, e.g. Ror.Ngor.3); operation start notification</w:t>
+      </w:r>
+    </w:p>
+    <w:p>
+      <w:pPr>
+        <w:spacing w:after="40"/>
+      </w:pPr>
+      <w:r>
+        <w:rPr>
+          <w:b/>
+          <w:i w:val="0"/>
+          <w:color w:val="202440"/>
+        </w:rPr>
+        <w:t>Submitted with the application:</w:t>
+      </w:r>
+    </w:p>
+    <w:p>
+      <w:pPr>
+        <w:pStyle w:val="ListBullet"/>
+        <w:spacing w:after="40"/>
+      </w:pPr>
+      <w:r>
+        <w:t>Machinery list with capacity and total horsepower (determines whether the Factory Act threshold is met)</w:t>
+      </w:r>
+    </w:p>
+    <w:p>
+      <w:pPr>
+        <w:pStyle w:val="ListBullet"/>
+        <w:spacing w:after="40"/>
+      </w:pPr>
+      <w:r>
+        <w:t>Building/occupancy certificate; site plan</w:t>
+      </w:r>
+    </w:p>
+    <w:p>
+      <w:pPr>
+        <w:pStyle w:val="ListBullet"/>
+        <w:spacing w:after="40"/>
+      </w:pPr>
+      <w:r>
+        <w:t>Environmental compliance (EIA approval or notification); waste &amp; byproduct management plan</w:t>
+      </w:r>
+    </w:p>
+    <w:p>
+      <w:pPr>
+        <w:pStyle w:val="ListBullet"/>
+        <w:spacing w:after="40"/>
+      </w:pPr>
+      <w:r>
+        <w:t>Worker-safety, fire-safety and occupational-health plans; factory-manager appointment; workers'-compensation insurance</w:t>
+      </w:r>
+    </w:p>
+    <w:p>
+      <w:pPr>
+        <w:spacing w:after="80"/>
+      </w:pPr>
+      <w:r>
+        <w:rPr>
+          <w:b w:val="0"/>
+          <w:i/>
+          <w:color w:val="555566"/>
+          <w:sz w:val="18"/>
+        </w:rPr>
+        <w:t>Note: confirm with DIW whether the facility's plant actually crosses the Factory Act threshold before assuming applicability.</w:t>
+      </w:r>
+    </w:p>
+    <w:p/>
+    <w:p>
+      <w:pPr>
+        <w:spacing w:after="80"/>
+      </w:pPr>
+      <w:r>
+        <w:rPr>
+          <w:b w:val="0"/>
+          <w:i/>
+          <w:color w:val="555566"/>
+          <w:sz w:val="18"/>
+        </w:rPr>
+        <w:t>Sources: BOI Investment Promotion Guide 2025 (boi.go.th); DBD Foreign Business Act application handbook (onestopservice.ditp.go.th) and DBD (dbd.go.th); ONEP / EIA Thailand (eiathailand.onep.go.th). Form codes verified June 2026 — re-check the authority's portal before lodging.</w:t>
+      </w:r>
+    </w:p>
+    <w:p/>
+    <w:p>
+      <w:pPr>
+        <w:spacing w:after="80"/>
+      </w:pPr>
+      <w:r>
+        <w:rPr>
+          <w:b w:val="0"/>
+          <w:i/>
+          <w:color w:val="555566"/>
+          <w:sz w:val="18"/>
+        </w:rPr>
+        <w:t>Prepared from the CHN1A permitting research package (Master Permitting Guide, EIA &amp; FBL detailed guides, BOI updates analysis, and the 23 permit checklists) plus the verified form/annex detail above. Figures are planning estimates — confirm current requirements with each authority before lodging.</w:t>
       </w:r>
     </w:p>
     <w:sectPr>

</xml_diff>